<commit_message>
Fix v2.9.1 PWA update and Villain filtering
- Restore the proven v2.9 PWA update flow for v2.9.1
- Fix update metadata and service worker handling
- Exclude default preflop folds from relevant Villains in player info
</commit_message>
<xml_diff>
--- a/docs/Gebruikershandleiding Live Poker Handlog v2.9.docx
+++ b/docs/Gebruikershandleiding Live Poker Handlog v2.9.docx
@@ -47,6 +47,12 @@
           <w:sz w:val="24"/>
         </w:rPr>
         <w:t>9</w:t>
+      </w:r>
+      <w:r>
+        <w:rPr>
+          <w:sz w:val="24"/>
+        </w:rPr>
+        <w:t>.1</w:t>
       </w:r>
     </w:p>
     <w:p/>
@@ -1700,34 +1706,41 @@
         <w:rPr>
           <w:lang w:val="en-US"/>
         </w:rPr>
-        <w:t xml:space="preserve">KO-, PKO- </w:t>
-      </w:r>
-      <w:proofErr w:type="spellStart"/>
-      <w:r>
-        <w:rPr>
-          <w:lang w:val="en-US"/>
-        </w:rPr>
-        <w:t>en</w:t>
-      </w:r>
-      <w:proofErr w:type="spellEnd"/>
-      <w:r>
-        <w:rPr>
-          <w:lang w:val="en-US"/>
-        </w:rPr>
-        <w:t xml:space="preserve"> Mystery Bounty-</w:t>
-      </w:r>
-      <w:proofErr w:type="spellStart"/>
-      <w:r>
-        <w:rPr>
-          <w:lang w:val="en-US"/>
-        </w:rPr>
-        <w:t>toernooien</w:t>
-      </w:r>
-      <w:proofErr w:type="spellEnd"/>
-      <w:r>
-        <w:rPr>
-          <w:lang w:val="en-US"/>
-        </w:rPr>
+        <w:t>KO-, PKO- en Mystery Bounty-toernooien;</w:t>
+      </w:r>
+    </w:p>
+    <w:p>
+      <w:pPr>
+        <w:pStyle w:val="Lijstopsomteken"/>
+      </w:pPr>
+      <w:r>
+        <w:t>handregistratie met geleide invoer;</w:t>
+      </w:r>
+    </w:p>
+    <w:p>
+      <w:pPr>
+        <w:pStyle w:val="Lijstopsomteken"/>
+      </w:pPr>
+      <w:r>
+        <w:t>spelersbibliotheek en sessiespelers;</w:t>
+      </w:r>
+    </w:p>
+    <w:p>
+      <w:pPr>
+        <w:pStyle w:val="Lijstopsomteken"/>
+      </w:pPr>
+      <w:r>
+        <w:t>handnotities en villainnotities;</w:t>
+      </w:r>
+    </w:p>
+    <w:p>
+      <w:pPr>
+        <w:pStyle w:val="Lijstopsomteken"/>
+      </w:pPr>
+      <w:r>
+        <w:t>bewerken van opgeslagen handen</w:t>
+      </w:r>
+      <w:r>
         <w:t>;</w:t>
       </w:r>
     </w:p>
@@ -1736,7 +1749,13 @@
         <w:pStyle w:val="Lijstopsomteken"/>
       </w:pPr>
       <w:r>
-        <w:t>handregistratie met geleide invoer;</w:t>
+        <w:t xml:space="preserve">rapportage </w:t>
+      </w:r>
+      <w:r>
+        <w:t>als afbeelding en tekst</w:t>
+      </w:r>
+      <w:r>
+        <w:t>;</w:t>
       </w:r>
     </w:p>
     <w:p>
@@ -1744,55 +1763,6 @@
         <w:pStyle w:val="Lijstopsomteken"/>
       </w:pPr>
       <w:r>
-        <w:t>spelersbibliotheek en sessiespelers;</w:t>
-      </w:r>
-    </w:p>
-    <w:p>
-      <w:pPr>
-        <w:pStyle w:val="Lijstopsomteken"/>
-      </w:pPr>
-      <w:r>
-        <w:t xml:space="preserve">handnotities en </w:t>
-      </w:r>
-      <w:proofErr w:type="spellStart"/>
-      <w:r>
-        <w:t>villainnotities</w:t>
-      </w:r>
-      <w:proofErr w:type="spellEnd"/>
-      <w:r>
-        <w:t>;</w:t>
-      </w:r>
-    </w:p>
-    <w:p>
-      <w:pPr>
-        <w:pStyle w:val="Lijstopsomteken"/>
-      </w:pPr>
-      <w:r>
-        <w:t>bewerken van opgeslagen handen</w:t>
-      </w:r>
-      <w:r>
-        <w:t>;</w:t>
-      </w:r>
-    </w:p>
-    <w:p>
-      <w:pPr>
-        <w:pStyle w:val="Lijstopsomteken"/>
-      </w:pPr>
-      <w:r>
-        <w:t xml:space="preserve">rapportage </w:t>
-      </w:r>
-      <w:r>
-        <w:t>als afbeelding en tekst</w:t>
-      </w:r>
-      <w:r>
-        <w:t>;</w:t>
-      </w:r>
-    </w:p>
-    <w:p>
-      <w:pPr>
-        <w:pStyle w:val="Lijstopsomteken"/>
-      </w:pPr>
-      <w:r>
         <w:t>lokale back-up</w:t>
       </w:r>
       <w:r>
@@ -1819,15 +1789,7 @@
     </w:p>
     <w:p>
       <w:r>
-        <w:t xml:space="preserve">Live Poker Handlog is een </w:t>
-      </w:r>
-      <w:proofErr w:type="spellStart"/>
-      <w:r>
-        <w:t>Progressive</w:t>
-      </w:r>
-      <w:proofErr w:type="spellEnd"/>
-      <w:r>
-        <w:t xml:space="preserve"> Web App (PWA). Je opent de app eerst in de browser</w:t>
+        <w:t>Live Poker Handlog is een Progressive Web App (PWA). Je opent de app eerst in de browser</w:t>
       </w:r>
       <w:r>
         <w:t xml:space="preserve">: </w:t>
@@ -1899,15 +1861,7 @@
         </w:numPr>
       </w:pPr>
       <w:r>
-        <w:t xml:space="preserve">Kies Toevoegen aan startscherm en daarna Installeren. Afhankelijk van de Chrome-versie kan direct Installeren of </w:t>
-      </w:r>
-      <w:proofErr w:type="spellStart"/>
-      <w:r>
-        <w:t>Install</w:t>
-      </w:r>
-      <w:proofErr w:type="spellEnd"/>
-      <w:r>
-        <w:t xml:space="preserve"> app worden getoond.</w:t>
+        <w:t>Kies Toevoegen aan startscherm en daarna Installeren. Afhankelijk van de Chrome-versie kan direct Installeren of Install app worden getoond.</w:t>
       </w:r>
     </w:p>
     <w:p>
@@ -1936,15 +1890,7 @@
     </w:p>
     <w:p>
       <w:r>
-        <w:t xml:space="preserve">Op een computer met Chrome kan bij een installeerbare </w:t>
-      </w:r>
-      <w:proofErr w:type="spellStart"/>
-      <w:r>
-        <w:t>web-app</w:t>
-      </w:r>
-      <w:proofErr w:type="spellEnd"/>
-      <w:r>
-        <w:t xml:space="preserve"> ook een installatieoptie in de adresbalk of in het Chrome-menu verschijnen. Gebruik die optie om Live Poker Handlog als app te installeren.</w:t>
+        <w:t>Op een computer met Chrome kan bij een installeerbare web-app ook een installatieoptie in de adresbalk of in het Chrome-menu verschijnen. Gebruik die optie om Live Poker Handlog als app te installeren.</w:t>
       </w:r>
     </w:p>
     <w:p>
@@ -2078,15 +2024,7 @@
     </w:p>
     <w:p>
       <w:r>
-        <w:t xml:space="preserve">Gebruik voor deze installatieroute Safari. Het toevoegen aan het beginscherm maakt van de website een </w:t>
-      </w:r>
-      <w:proofErr w:type="spellStart"/>
-      <w:r>
-        <w:t>web-app</w:t>
-      </w:r>
-      <w:proofErr w:type="spellEnd"/>
-      <w:r>
-        <w:t xml:space="preserve"> die vanuit een eigen venster kan worden geopend.</w:t>
+        <w:t>Gebruik voor deze installatieroute Safari. Het toevoegen aan het beginscherm maakt van de website een web-app die vanuit een eigen venster kan worden geopend.</w:t>
       </w:r>
     </w:p>
     <w:p>
@@ -2095,14 +2033,9 @@
       </w:pPr>
       <w:bookmarkStart w:id="4" w:name="_Toc240798761"/>
       <w:r>
-        <w:t xml:space="preserve">Microsoft </w:t>
-      </w:r>
-      <w:proofErr w:type="spellStart"/>
-      <w:r>
-        <w:t>Edge</w:t>
+        <w:t>Microsoft Edge</w:t>
       </w:r>
       <w:bookmarkEnd w:id="4"/>
-      <w:proofErr w:type="spellEnd"/>
     </w:p>
     <w:p>
       <w:pPr>
@@ -2113,15 +2046,7 @@
         </w:numPr>
       </w:pPr>
       <w:r>
-        <w:t xml:space="preserve">Open Live Poker Handlog in Microsoft </w:t>
-      </w:r>
-      <w:proofErr w:type="spellStart"/>
-      <w:r>
-        <w:t>Edge</w:t>
-      </w:r>
-      <w:proofErr w:type="spellEnd"/>
-      <w:r>
-        <w:t>.</w:t>
+        <w:t>Open Live Poker Handlog in Microsoft Edge.</w:t>
       </w:r>
     </w:p>
     <w:p>
@@ -2364,33 +2289,11 @@
         </w:rPr>
         <w:t xml:space="preserve"> (</w:t>
       </w:r>
-      <w:proofErr w:type="spellStart"/>
       <w:r>
         <w:rPr>
           <w:lang w:val="en-US"/>
         </w:rPr>
-        <w:t>reguliere</w:t>
-      </w:r>
-      <w:proofErr w:type="spellEnd"/>
-      <w:r>
-        <w:rPr>
-          <w:lang w:val="en-US"/>
-        </w:rPr>
-        <w:t xml:space="preserve"> </w:t>
-      </w:r>
-      <w:proofErr w:type="spellStart"/>
-      <w:r>
-        <w:rPr>
-          <w:lang w:val="en-US"/>
-        </w:rPr>
-        <w:t>en</w:t>
-      </w:r>
-      <w:proofErr w:type="spellEnd"/>
-      <w:r>
-        <w:rPr>
-          <w:lang w:val="en-US"/>
-        </w:rPr>
-        <w:t>/of button-straddle)</w:t>
+        <w:t>reguliere en/of button-straddle)</w:t>
       </w:r>
       <w:r>
         <w:rPr>
@@ -3771,87 +3674,7 @@
       </w:r>
       <w:r>
         <w:br/>
-        <w:t xml:space="preserve">Bij het rapport kun je kiezen tussen Uitgebreid en Verkort. Daarnaast kun je de taal van het rapport instellen op </w:t>
-      </w:r>
-      <w:r>
-        <w:t>Nederland (</w:t>
-      </w:r>
-      <w:r>
-        <w:t>NL</w:t>
-      </w:r>
-      <w:r>
-        <w:t>)</w:t>
-      </w:r>
-      <w:r>
-        <w:t xml:space="preserve"> of </w:t>
-      </w:r>
-      <w:r>
-        <w:t>Engels (</w:t>
-      </w:r>
-      <w:r>
-        <w:t>EN</w:t>
-      </w:r>
-      <w:r>
-        <w:t>)</w:t>
-      </w:r>
-      <w:r>
-        <w:t xml:space="preserve"> </w:t>
-      </w:r>
-      <w:proofErr w:type="spellStart"/>
-      <w:r>
-        <w:t>en</w:t>
-      </w:r>
-      <w:proofErr w:type="spellEnd"/>
-      <w:r>
-        <w:t xml:space="preserve"> voor Hero kiezen tussen de weergave</w:t>
-      </w:r>
-      <w:r>
-        <w:t xml:space="preserve"> in</w:t>
-      </w:r>
-      <w:r>
-        <w:t xml:space="preserve"> </w:t>
-      </w:r>
-      <w:r>
-        <w:t>“</w:t>
-      </w:r>
-      <w:r>
-        <w:t>Ik</w:t>
-      </w:r>
-      <w:r>
-        <w:t>”</w:t>
-      </w:r>
-      <w:r>
-        <w:t>/</w:t>
-      </w:r>
-      <w:r>
-        <w:t>”</w:t>
-      </w:r>
-      <w:r>
-        <w:t>I</w:t>
-      </w:r>
-      <w:r>
-        <w:t>”</w:t>
-      </w:r>
-      <w:r>
-        <w:t xml:space="preserve"> </w:t>
-      </w:r>
-      <w:r>
-        <w:t>of</w:t>
-      </w:r>
-      <w:r>
-        <w:t xml:space="preserve"> </w:t>
-      </w:r>
-      <w:r>
-        <w:t>“</w:t>
-      </w:r>
-      <w:r>
-        <w:t>Hero</w:t>
-      </w:r>
-      <w:r>
-        <w:t>”</w:t>
-      </w:r>
-      <w:r>
-        <w:t>. De taalkeuze geldt voor het rapport; de bediening van de app blijft Nederlands.</w:t>
+        <w:t>Bij het rapport kun je kiezen tussen Uitgebreid en Verkort. Daarnaast kun je de taal van het rapport instellen op Nederland (NL) of Engels (EN) en voor Hero kiezen tussen de weergave in “Ik”/”I” of “Hero”. De taalkeuze geldt voor het rapport; de bediening van de app blijft Nederlands.</w:t>
       </w:r>
       <w:r>
         <w:br/>

</xml_diff>